<commit_message>
Housekeeping (taking the TRASH OUT)
</commit_message>
<xml_diff>
--- a/LR01/Котов_Дэвид_Арсенович_Вариант_27_ЛР_1.docx
+++ b/LR01/Котов_Дэвид_Арсенович_Вариант_27_ЛР_1.docx
@@ -4672,10 +4672,7 @@
         <w:t>6</w:t>
       </w:r>
       <w:r>
-        <w:t xml:space="preserve"> — </w:t>
-      </w:r>
-      <w:r>
-        <w:t xml:space="preserve">Добавление </w:t>
+        <w:t xml:space="preserve"> — Добавление </w:t>
       </w:r>
       <w:r>
         <w:rPr>
@@ -4905,11 +4902,11 @@
             </w:pPr>
             <w:proofErr w:type="spellStart"/>
             <w:r>
-              <w:t>reports</w:t>
+              <w:t>reports/passport.md</w:t>
             </w:r>
             <w:proofErr w:type="spellEnd"/>
             <w:r>
-              <w:t>/passport.pdf</w:t>
+              <w:t/>
             </w:r>
           </w:p>
         </w:tc>
@@ -4923,7 +4920,7 @@
               <w:keepNext/>
             </w:pPr>
             <w:r>
-              <w:t>Паспорт локального эксперимента</w:t>
+              <w:t>Паспорт эксперимента — части А и Б</w:t>
             </w:r>
           </w:p>
         </w:tc>
@@ -5166,6 +5163,9 @@
       </w:r>
     </w:p>
     <w:p>
+      <w:pPr>
+        <w:spacing w:line="276" w:lineRule="auto"/>
+      </w:pPr>
       <w:r>
         <w:t xml:space="preserve">1. Зачем несколько запусков? Один </w:t>
       </w:r>
@@ -5187,6 +5187,9 @@
       </w:r>
     </w:p>
     <w:p>
+      <w:pPr>
+        <w:spacing w:line="276" w:lineRule="auto"/>
+      </w:pPr>
       <w:r>
         <w:t xml:space="preserve">2. Расчёт по пяти </w:t>
       </w:r>
@@ -5200,67 +5203,82 @@
       </w:r>
     </w:p>
     <w:p>
+      <w:pPr>
+        <w:spacing w:line="276" w:lineRule="auto"/>
+      </w:pPr>
       <w:r>
         <w:t>3. Почему полный массив? Массивы (0,255) и (127,128) имеют одно среднее 127,5, но разные пиксели. Отпечаток учитывает все байты.</w:t>
       </w:r>
     </w:p>
     <w:p>
+      <w:pPr>
+        <w:spacing w:line="276" w:lineRule="auto"/>
+      </w:pPr>
+      <w:r>
+        <w:t xml:space="preserve">4. Почему могут различаться PNG? Разная версия сжатия может изменить байты файла при тех же пикселях. Поэтому отдельно записываются </w:t>
+      </w:r>
+      <w:proofErr w:type="spellStart"/>
+      <w:r>
+        <w:t>zlib</w:t>
+      </w:r>
+      <w:proofErr w:type="spellEnd"/>
+      <w:r>
+        <w:t>, отпечаток массива и отпечаток PNG.</w:t>
+      </w:r>
+    </w:p>
+    <w:p>
+      <w:pPr>
+        <w:spacing w:line="276" w:lineRule="auto"/>
+      </w:pPr>
       <w:r>
         <w:lastRenderedPageBreak/>
-        <w:t xml:space="preserve">4. Почему могут различаться PNG? Разная версия сжатия может изменить байты файла при тех же пикселях. Поэтому отдельно записываются </w:t>
+        <w:t xml:space="preserve">5. Что означает s=0? Метрика совпала во всех запусках. Нужно проверить </w:t>
       </w:r>
       <w:proofErr w:type="spellStart"/>
       <w:r>
-        <w:t>zlib</w:t>
+        <w:t>seed</w:t>
       </w:r>
       <w:proofErr w:type="spellEnd"/>
       <w:r>
-        <w:t>, отпечаток массива и отпечаток PNG.</w:t>
-      </w:r>
-    </w:p>
-    <w:p>
-      <w:r>
-        <w:t xml:space="preserve">5. Что означает s=0? Метрика совпала во всех запусках. Нужно проверить </w:t>
+        <w:t>, отпечатки и агрегацию. Это не обязательно ошибка; при n=1 выборочное s не определено.</w:t>
+      </w:r>
+    </w:p>
+    <w:p>
+      <w:pPr>
+        <w:spacing w:line="276" w:lineRule="auto"/>
+      </w:pPr>
+      <w:r>
+        <w:t xml:space="preserve">6. Как найти </w:t>
       </w:r>
       <w:proofErr w:type="spellStart"/>
       <w:r>
+        <w:t>невоспроизводимость</w:t>
+      </w:r>
+      <w:proofErr w:type="spellEnd"/>
+      <w:r>
+        <w:t xml:space="preserve">? Проверить предупреждения, фактические </w:t>
+      </w:r>
+      <w:proofErr w:type="spellStart"/>
+      <w:r>
         <w:t>seed</w:t>
       </w:r>
       <w:proofErr w:type="spellEnd"/>
       <w:r>
-        <w:t>, отпечатки и агрегацию. Это не обязательно ошибка; при n=1 выборочное s не определено.</w:t>
-      </w:r>
-    </w:p>
-    <w:p>
-      <w:r>
-        <w:t xml:space="preserve">6. Как найти </w:t>
+        <w:t xml:space="preserve">, параметры, версии и отпечатки. В опыте причиной стал выбор </w:t>
       </w:r>
       <w:proofErr w:type="spellStart"/>
       <w:r>
-        <w:t>невоспроизводимость</w:t>
+        <w:t>seed</w:t>
       </w:r>
       <w:proofErr w:type="spellEnd"/>
       <w:r>
-        <w:t xml:space="preserve">? Проверить предупреждения, фактические </w:t>
-      </w:r>
-      <w:proofErr w:type="spellStart"/>
-      <w:r>
-        <w:t>seed</w:t>
-      </w:r>
-      <w:proofErr w:type="spellEnd"/>
-      <w:r>
-        <w:t xml:space="preserve">, параметры, версии и отпечатки. В опыте причиной стал выбор </w:t>
-      </w:r>
-      <w:proofErr w:type="spellStart"/>
-      <w:r>
-        <w:t>seed</w:t>
-      </w:r>
-      <w:proofErr w:type="spellEnd"/>
-      <w:r>
         <w:t xml:space="preserve"> по времени.</w:t>
       </w:r>
     </w:p>
     <w:p>
+      <w:pPr>
+        <w:spacing w:line="276" w:lineRule="auto"/>
+      </w:pPr>
       <w:r>
         <w:t xml:space="preserve">7. Зачем </w:t>
       </w:r>
@@ -5284,6 +5302,9 @@
       </w:r>
     </w:p>
     <w:p>
+      <w:pPr>
+        <w:spacing w:line="276" w:lineRule="auto"/>
+      </w:pPr>
       <w:r>
         <w:t xml:space="preserve">8. Что хранится в паспорте? Цель и критерий, данные, код и версия, параметры и </w:t>
       </w:r>
@@ -5297,11 +5318,17 @@
       </w:r>
     </w:p>
     <w:p>
+      <w:pPr>
+        <w:spacing w:line="276" w:lineRule="auto"/>
+      </w:pPr>
       <w:r>
         <w:t>9. Зачем точные версии? Диапазон допускает обновление зависимостей без изменения файла. Здесь сторонних пакетов нет, но версия Python записана отдельно.</w:t>
       </w:r>
     </w:p>
     <w:p>
+      <w:pPr>
+        <w:spacing w:line="276" w:lineRule="auto"/>
+      </w:pPr>
       <w:r>
         <w:t xml:space="preserve">10. Что добавить для «текст → изображение»? Ревизию весов, точный запрос, </w:t>
       </w:r>
@@ -5741,44 +5768,31 @@
             </w:r>
             <w:proofErr w:type="spellEnd"/>
             <w:r>
-              <w:t xml:space="preserve"> и четыре снимка приложены</w:t>
-            </w:r>
-          </w:p>
-        </w:tc>
-      </w:tr>
-      <w:tr>
-        <w:trPr>
-          <w:cantSplit/>
-        </w:trPr>
-        <w:tc>
-          <w:tcPr>
-            <w:tcW w:w="4675" w:type="dxa"/>
-          </w:tcPr>
-          <w:p>
-            <w:pPr>
-              <w:pStyle w:val="TableText"/>
-            </w:pPr>
-            <w:r>
-              <w:t>Оформление</w:t>
-            </w:r>
-          </w:p>
-        </w:tc>
-        <w:tc>
-          <w:tcPr>
-            <w:tcW w:w="4675" w:type="dxa"/>
-          </w:tcPr>
-          <w:p>
-            <w:pPr>
-              <w:pStyle w:val="TableText"/>
-            </w:pPr>
-            <w:r>
-              <w:t>Отчёт DOCX, паспорт PDF; осталось указать группу и проверяющего</w:t>
+              <w:t xml:space="preserve"> и </w:t>
+            </w:r>
+            <w:r>
+              <w:t>пять</w:t>
+            </w:r>
+            <w:r>
+              <w:t xml:space="preserve"> снимк</w:t>
+            </w:r>
+            <w:r>
+              <w:t xml:space="preserve">ов </w:t>
+            </w:r>
+            <w:r>
+              <w:t>приложены</w:t>
             </w:r>
           </w:p>
         </w:tc>
       </w:tr>
     </w:tbl>
-    <w:p/>
+    <w:p>
+      <w:pPr>
+        <w:tabs>
+          <w:tab w:val="left" w:pos="1187"/>
+        </w:tabs>
+      </w:pPr>
+    </w:p>
     <w:sectPr>
       <w:pgSz w:w="11906" w:h="16838"/>
       <w:pgMar w:top="1134" w:right="850" w:bottom="1134" w:left="1701" w:header="720" w:footer="720" w:gutter="0"/>

</xml_diff>